<commit_message>
Repairs master: fix duplicate signature control ids (Word unreadable-content)
</commit_message>
<xml_diff>
--- a/Deck_FinalRepairsMaster.docx
+++ b/Deck_FinalRepairsMaster.docx
@@ -11664,48 +11664,27 @@
             </w:dropDownList>
           </w:sdtPr>
           <w:sdtContent>
-            <w:sdt>
-              <w:sdtPr>
-                <w:rPr>
-                  <w:rFonts w:cstheme="minorHAnsi"/>
-                </w:rPr>
-                <w:tag w:val="|PREV=David Mazor|"/>
-                <w:id w:val="-630402088"/>
-                <w:lock w:val="sdtLocked"/>
-                <w:dropDownList>
-                  <w:listItem w:value="Choose an item."/>
-                  <w:listItem w:displayText="David Mazor" w:value="David Mazor"/>
-                  <w:listItem w:displayText="Mark Marsch" w:value="Mark Marsch"/>
-                  <w:listItem w:displayText="Varoozh Saroian" w:value="Varoozh Saroian"/>
-                  <w:listItem w:displayText="Paul Kushner" w:value="Paul Kushner"/>
-                  <w:listItem w:displayText="NA" w:value="NA"/>
-                </w:dropDownList>
-              </w:sdtPr>
-              <w:sdtEndPr/>
-              <w:sdtContent>
-                <w:tc>
-                  <w:tcPr>
-                    <w:tcW w:w="3510" w:type="dxa"/>
-                  </w:tcPr>
-                  <w:p>
-                    <w:pPr>
-                      <w:autoSpaceDE w:val="0"/>
-                      <w:autoSpaceDN w:val="0"/>
-                      <w:adjustRightInd w:val="0"/>
-                      <w:rPr>
-                        <w:rFonts w:cstheme="minorHAnsi"/>
-                      </w:rPr>
-                    </w:pPr>
-                    <w:r>
-                      <w:rPr>
-                        <w:rFonts w:cstheme="minorHAnsi"/>
-                      </w:rPr>
-                      <w:t>David Mazor</w:t>
-                    </w:r>
-                  </w:p>
-                </w:tc>
-              </w:sdtContent>
-            </w:sdt>
+            <w:tc>
+              <w:tcPr>
+                <w:tcW w:w="3510" w:type="dxa"/>
+              </w:tcPr>
+              <w:p>
+                <w:pPr>
+                  <w:autoSpaceDE w:val="0"/>
+                  <w:autoSpaceDN w:val="0"/>
+                  <w:adjustRightInd w:val="0"/>
+                  <w:rPr>
+                    <w:rFonts w:cstheme="minorHAnsi"/>
+                  </w:rPr>
+                </w:pPr>
+                <w:r>
+                  <w:rPr>
+                    <w:rFonts w:cstheme="minorHAnsi"/>
+                  </w:rPr>
+                  <w:t>David Mazor</w:t>
+                </w:r>
+              </w:p>
+            </w:tc>
           </w:sdtContent>
         </w:sdt>
       </w:tr>
@@ -11748,47 +11727,27 @@
             </w:dropDownList>
           </w:sdtPr>
           <w:sdtContent>
-            <w:sdt>
-              <w:sdtPr>
-                <w:rPr>
-                  <w:rFonts w:cstheme="minorHAnsi"/>
-                </w:rPr>
-                <w:tag w:val="|PREV=E3 Certified Inspector|"/>
-                <w:id w:val="420918251"/>
-                <w:lock w:val="sdtLocked"/>
-                <w:dropDownList>
-                  <w:listItem w:value="Choose an item."/>
-                  <w:listItem w:displayText="General Contractor" w:value="General Contractor"/>
-                  <w:listItem w:displayText="CA Architect" w:value="CA Architect"/>
-                  <w:listItem w:displayText="E3 Certified Inspector" w:value="E3 Certified Inspector"/>
-                  <w:listItem w:displayText="NA" w:value="NA"/>
-                </w:dropDownList>
-              </w:sdtPr>
-              <w:sdtEndPr/>
-              <w:sdtContent>
-                <w:tc>
-                  <w:tcPr>
-                    <w:tcW w:w="3510" w:type="dxa"/>
-                  </w:tcPr>
-                  <w:p>
-                    <w:pPr>
-                      <w:autoSpaceDE w:val="0"/>
-                      <w:autoSpaceDN w:val="0"/>
-                      <w:adjustRightInd w:val="0"/>
-                      <w:rPr>
-                        <w:rFonts w:cstheme="minorHAnsi"/>
-                      </w:rPr>
-                    </w:pPr>
-                    <w:r>
-                      <w:rPr>
-                        <w:rFonts w:cstheme="minorHAnsi"/>
-                      </w:rPr>
-                      <w:t>E3 Certified Inspector</w:t>
-                    </w:r>
-                  </w:p>
-                </w:tc>
-              </w:sdtContent>
-            </w:sdt>
+            <w:tc>
+              <w:tcPr>
+                <w:tcW w:w="3510" w:type="dxa"/>
+              </w:tcPr>
+              <w:p>
+                <w:pPr>
+                  <w:autoSpaceDE w:val="0"/>
+                  <w:autoSpaceDN w:val="0"/>
+                  <w:adjustRightInd w:val="0"/>
+                  <w:rPr>
+                    <w:rFonts w:cstheme="minorHAnsi"/>
+                  </w:rPr>
+                </w:pPr>
+                <w:r>
+                  <w:rPr>
+                    <w:rFonts w:cstheme="minorHAnsi"/>
+                  </w:rPr>
+                  <w:t>E3 Certified Inspector</w:t>
+                </w:r>
+              </w:p>
+            </w:tc>
           </w:sdtContent>
         </w:sdt>
       </w:tr>
@@ -11831,47 +11790,27 @@
             </w:dropDownList>
           </w:sdtPr>
           <w:sdtContent>
-            <w:sdt>
-              <w:sdtPr>
-                <w:rPr>
-                  <w:rFonts w:cstheme="minorHAnsi"/>
-                </w:rPr>
-                <w:tag w:val="|PREV=DM CA GC 714639|"/>
-                <w:id w:val="-2135779939"/>
-                <w:lock w:val="sdtLocked"/>
-                <w:dropDownList>
-                  <w:listItem w:value="Choose an item."/>
-                  <w:listItem w:displayText="DM CA GC 714639" w:value="DM CA GC 714639"/>
-                  <w:listItem w:displayText="VS Architect CA - C13791" w:value="VS Architect CA - C13791"/>
-                  <w:listItem w:displayText="PK Architect CA- C 26488" w:value="PK Architect CA- C 26488"/>
-                  <w:listItem w:displayText="NA" w:value="NA"/>
-                </w:dropDownList>
-              </w:sdtPr>
-              <w:sdtEndPr/>
-              <w:sdtContent>
-                <w:tc>
-                  <w:tcPr>
-                    <w:tcW w:w="3510" w:type="dxa"/>
-                  </w:tcPr>
-                  <w:p>
-                    <w:pPr>
-                      <w:autoSpaceDE w:val="0"/>
-                      <w:autoSpaceDN w:val="0"/>
-                      <w:adjustRightInd w:val="0"/>
-                      <w:rPr>
-                        <w:rFonts w:cstheme="minorHAnsi"/>
-                      </w:rPr>
-                    </w:pPr>
-                    <w:r>
-                      <w:rPr>
-                        <w:rFonts w:cstheme="minorHAnsi"/>
-                      </w:rPr>
-                      <w:t>DM CA GC 714639</w:t>
-                    </w:r>
-                  </w:p>
-                </w:tc>
-              </w:sdtContent>
-            </w:sdt>
+            <w:tc>
+              <w:tcPr>
+                <w:tcW w:w="3510" w:type="dxa"/>
+              </w:tcPr>
+              <w:p>
+                <w:pPr>
+                  <w:autoSpaceDE w:val="0"/>
+                  <w:autoSpaceDN w:val="0"/>
+                  <w:adjustRightInd w:val="0"/>
+                  <w:rPr>
+                    <w:rFonts w:cstheme="minorHAnsi"/>
+                  </w:rPr>
+                </w:pPr>
+                <w:r>
+                  <w:rPr>
+                    <w:rFonts w:cstheme="minorHAnsi"/>
+                  </w:rPr>
+                  <w:t>DM CA GC 714639</w:t>
+                </w:r>
+              </w:p>
+            </w:tc>
           </w:sdtContent>
         </w:sdt>
       </w:tr>
@@ -13114,7 +13053,7 @@
                 </w:rPr>
                 <w:alias w:val="conf_waterproofing_yes"/>
                 <w:tag w:val="conf_waterproofing_yes"/>
-                <w:id w:val="56814403"/>
+                <w:id w:val="13245079"/>
                 <w14:checkbox>
                   <w14:checked w14:val="1"/>
                   <w14:checkedState w14:val="2612" w14:font="MS Gothic"/>
@@ -13152,7 +13091,7 @@
                 </w:rPr>
                 <w:alias w:val="conf_waterproofing_no"/>
                 <w:tag w:val="conf_waterproofing_no"/>
-                <w:id w:val="49768237"/>
+                <w:id w:val="83449982"/>
                 <w14:checkbox>
                   <w14:checked w14:val="0"/>
                   <w14:checkedState w14:val="2612" w14:font="MS Gothic"/>
@@ -13208,7 +13147,7 @@
                 </w:rPr>
                 <w:alias w:val="conf_leaks_yes"/>
                 <w:tag w:val="conf_leaks_yes"/>
-                <w:id w:val="43914369"/>
+                <w:id w:val="90007143"/>
                 <w14:checkbox>
                   <w14:checked w14:val="0"/>
                   <w14:checkedState w14:val="2612" w14:font="MS Gothic"/>
@@ -13246,7 +13185,7 @@
                 </w:rPr>
                 <w:alias w:val="conf_leaks_no"/>
                 <w:tag w:val="conf_leaks_no"/>
-                <w:id w:val="27363946"/>
+                <w:id w:val="59987498"/>
                 <w14:checkbox>
                   <w14:checked w14:val="1"/>
                   <w14:checkedState w14:val="2612" w14:font="MS Gothic"/>
@@ -13302,7 +13241,7 @@
                 </w:rPr>
                 <w:alias w:val="conf_rot_yes"/>
                 <w:tag w:val="conf_rot_yes"/>
-                <w:id w:val="15652989"/>
+                <w:id w:val="27092324"/>
                 <w14:checkbox>
                   <w14:checked w14:val="1"/>
                   <w14:checkedState w14:val="2612" w14:font="MS Gothic"/>
@@ -13340,7 +13279,7 @@
                 </w:rPr>
                 <w:alias w:val="conf_rot_no"/>
                 <w:tag w:val="conf_rot_no"/>
-                <w:id w:val="53973872"/>
+                <w:id w:val="64022584"/>
                 <w14:checkbox>
                   <w14:checked w14:val="0"/>
                   <w14:checkedState w14:val="2612" w14:font="MS Gothic"/>
@@ -13396,7 +13335,7 @@
                 </w:rPr>
                 <w:alias w:val="conf_substrate_yes"/>
                 <w:tag w:val="conf_substrate_yes"/>
-                <w:id w:val="25503656"/>
+                <w:id w:val="78900000"/>
                 <w14:checkbox>
                   <w14:checked w14:val="0"/>
                   <w14:checkedState w14:val="2612" w14:font="MS Gothic"/>
@@ -13434,7 +13373,7 @@
                 </w:rPr>
                 <w:alias w:val="conf_substrate_no"/>
                 <w:tag w:val="conf_substrate_no"/>
-                <w:id w:val="5695446"/>
+                <w:id w:val="43227277"/>
                 <w14:checkbox>
                   <w14:checked w14:val="1"/>
                   <w14:checkedState w14:val="2612" w14:font="MS Gothic"/>
@@ -13490,7 +13429,7 @@
                 </w:rPr>
                 <w:alias w:val="conf_railings_yes"/>
                 <w:tag w:val="conf_railings_yes"/>
-                <w:id w:val="21954158"/>
+                <w:id w:val="79563093"/>
                 <w14:checkbox>
                   <w14:checked w14:val="1"/>
                   <w14:checkedState w14:val="2612" w14:font="MS Gothic"/>
@@ -13528,7 +13467,7 @@
                 </w:rPr>
                 <w:alias w:val="conf_railings_no"/>
                 <w:tag w:val="conf_railings_no"/>
-                <w:id w:val="62898694"/>
+                <w:id w:val="61947479"/>
                 <w14:checkbox>
                   <w14:checked w14:val="0"/>
                   <w14:checkedState w14:val="2612" w14:font="MS Gothic"/>
@@ -13584,7 +13523,7 @@
                 </w:rPr>
                 <w:alias w:val="conf_loadbearing_yes"/>
                 <w:tag w:val="conf_loadbearing_yes"/>
-                <w:id w:val="52877246"/>
+                <w:id w:val="34081947"/>
                 <w14:checkbox>
                   <w14:checked w14:val="1"/>
                   <w14:checkedState w14:val="2612" w14:font="MS Gothic"/>
@@ -13622,7 +13561,7 @@
                 </w:rPr>
                 <w:alias w:val="conf_loadbearing_no"/>
                 <w:tag w:val="conf_loadbearing_no"/>
-                <w:id w:val="37426907"/>
+                <w:id w:val="31356641"/>
                 <w14:checkbox>
                   <w14:checked w14:val="0"/>
                   <w14:checkedState w14:val="2612" w14:font="MS Gothic"/>

</xml_diff>

<commit_message>
Repairs master: remove Repair Method + gap; orig-date placeholder
</commit_message>
<xml_diff>
--- a/Deck_FinalRepairsMaster.docx
+++ b/Deck_FinalRepairsMaster.docx
@@ -1520,6 +1520,13 @@
                 <w:bCs/>
               </w:rPr>
               <w:t/>
+            </w:r>
+            <w:r>
+              <w:rPr>
+                <w:b/>
+                <w:bCs/>
+              </w:rPr>
+              <w:t>03/21/2024</w:t>
             </w:r>
           </w:p>
         </w:tc>
@@ -9371,377 +9378,6 @@
               <w:t xml:space="preserve">All repairs are to be in accordance with State and Local Building Codes by State Licensed Contractor(s) </w:t>
             </w:r>
           </w:p>
-          <w:p>
-            <w:pPr>
-              <w:pStyle w:val="BodyText"/>
-              <w:tabs>
-                <w:tab w:val="left" w:pos="6086"/>
-              </w:tabs>
-              <w:spacing w:before="179" w:line="259" w:lineRule="auto"/>
-              <w:ind w:right="374"/>
-              <w:jc w:val="center"/>
-              <w:rPr>
-                <w:rFonts w:asciiTheme="minorHAnsi" w:hAnsiTheme="minorHAnsi" w:cstheme="minorHAnsi"/>
-                <w:b/>
-                <w:bCs/>
-                <w:caps/>
-                <w:sz w:val="32"/>
-                <w:szCs w:val="32"/>
-              </w:rPr>
-            </w:pPr>
-          </w:p>
-          <w:p>
-            <w:pPr>
-              <w:pStyle w:val="BodyText"/>
-              <w:tabs>
-                <w:tab w:val="left" w:pos="6086"/>
-              </w:tabs>
-              <w:spacing w:before="179" w:line="259" w:lineRule="auto"/>
-              <w:ind w:right="374"/>
-              <w:jc w:val="center"/>
-              <w:rPr>
-                <w:rFonts w:asciiTheme="minorHAnsi" w:hAnsiTheme="minorHAnsi" w:cstheme="minorHAnsi"/>
-                <w:b/>
-                <w:bCs/>
-                <w:caps/>
-                <w:sz w:val="32"/>
-                <w:szCs w:val="32"/>
-              </w:rPr>
-            </w:pPr>
-          </w:p>
-          <w:p>
-            <w:pPr>
-              <w:pStyle w:val="BodyText"/>
-              <w:tabs>
-                <w:tab w:val="left" w:pos="6086"/>
-              </w:tabs>
-              <w:spacing w:before="179" w:line="259" w:lineRule="auto"/>
-              <w:ind w:right="374"/>
-              <w:jc w:val="center"/>
-              <w:rPr>
-                <w:rFonts w:asciiTheme="minorHAnsi" w:hAnsiTheme="minorHAnsi" w:cstheme="minorHAnsi"/>
-                <w:b/>
-                <w:bCs/>
-                <w:caps/>
-                <w:sz w:val="32"/>
-                <w:szCs w:val="32"/>
-              </w:rPr>
-            </w:pPr>
-          </w:p>
-          <w:p>
-            <w:pPr>
-              <w:pStyle w:val="BodyText"/>
-              <w:tabs>
-                <w:tab w:val="left" w:pos="6086"/>
-              </w:tabs>
-              <w:spacing w:before="179" w:line="259" w:lineRule="auto"/>
-              <w:ind w:right="374"/>
-              <w:jc w:val="center"/>
-              <w:rPr>
-                <w:rFonts w:asciiTheme="minorHAnsi" w:hAnsiTheme="minorHAnsi" w:cstheme="minorHAnsi"/>
-                <w:b/>
-                <w:bCs/>
-                <w:caps/>
-                <w:sz w:val="32"/>
-                <w:szCs w:val="32"/>
-              </w:rPr>
-            </w:pPr>
-          </w:p>
-          <w:p>
-            <w:pPr>
-              <w:pStyle w:val="BodyText"/>
-              <w:tabs>
-                <w:tab w:val="left" w:pos="6086"/>
-              </w:tabs>
-              <w:spacing w:before="179" w:line="259" w:lineRule="auto"/>
-              <w:ind w:right="374"/>
-              <w:jc w:val="center"/>
-              <w:rPr>
-                <w:rFonts w:asciiTheme="minorHAnsi" w:hAnsiTheme="minorHAnsi" w:cstheme="minorHAnsi"/>
-                <w:b/>
-                <w:bCs/>
-                <w:caps/>
-                <w:sz w:val="32"/>
-                <w:szCs w:val="32"/>
-              </w:rPr>
-            </w:pPr>
-          </w:p>
-          <w:p>
-            <w:pPr>
-              <w:pStyle w:val="BodyText"/>
-              <w:tabs>
-                <w:tab w:val="left" w:pos="6086"/>
-              </w:tabs>
-              <w:spacing w:before="179" w:line="259" w:lineRule="auto"/>
-              <w:ind w:right="374"/>
-              <w:jc w:val="center"/>
-              <w:rPr>
-                <w:rFonts w:asciiTheme="minorHAnsi" w:hAnsiTheme="minorHAnsi" w:cstheme="minorHAnsi"/>
-                <w:b/>
-                <w:bCs/>
-                <w:caps/>
-                <w:sz w:val="32"/>
-                <w:szCs w:val="32"/>
-              </w:rPr>
-            </w:pPr>
-          </w:p>
-          <w:p>
-            <w:pPr>
-              <w:pStyle w:val="BodyText"/>
-              <w:tabs>
-                <w:tab w:val="left" w:pos="6086"/>
-              </w:tabs>
-              <w:spacing w:before="179" w:line="259" w:lineRule="auto"/>
-              <w:ind w:right="374"/>
-              <w:jc w:val="center"/>
-              <w:rPr>
-                <w:rFonts w:asciiTheme="minorHAnsi" w:hAnsiTheme="minorHAnsi" w:cstheme="minorHAnsi"/>
-                <w:b/>
-                <w:bCs/>
-                <w:caps/>
-                <w:sz w:val="32"/>
-                <w:szCs w:val="32"/>
-              </w:rPr>
-            </w:pPr>
-          </w:p>
-          <w:p>
-            <w:pPr>
-              <w:pStyle w:val="BodyText"/>
-              <w:tabs>
-                <w:tab w:val="left" w:pos="6086"/>
-              </w:tabs>
-              <w:spacing w:before="179" w:line="259" w:lineRule="auto"/>
-              <w:ind w:right="374"/>
-              <w:jc w:val="center"/>
-              <w:rPr>
-                <w:rFonts w:asciiTheme="minorHAnsi" w:hAnsiTheme="minorHAnsi" w:cstheme="minorHAnsi"/>
-                <w:b/>
-                <w:bCs/>
-                <w:caps/>
-                <w:sz w:val="32"/>
-                <w:szCs w:val="32"/>
-              </w:rPr>
-            </w:pPr>
-          </w:p>
-          <w:p>
-            <w:pPr>
-              <w:pStyle w:val="BodyText"/>
-              <w:tabs>
-                <w:tab w:val="left" w:pos="6086"/>
-              </w:tabs>
-              <w:spacing w:before="179" w:line="259" w:lineRule="auto"/>
-              <w:ind w:right="374"/>
-              <w:jc w:val="center"/>
-              <w:rPr>
-                <w:rFonts w:asciiTheme="minorHAnsi" w:hAnsiTheme="minorHAnsi" w:cstheme="minorHAnsi"/>
-                <w:b/>
-                <w:bCs/>
-                <w:caps/>
-                <w:sz w:val="32"/>
-                <w:szCs w:val="32"/>
-              </w:rPr>
-            </w:pPr>
-          </w:p>
-          <w:p>
-            <w:pPr>
-              <w:pStyle w:val="BodyText"/>
-              <w:tabs>
-                <w:tab w:val="left" w:pos="6086"/>
-              </w:tabs>
-              <w:spacing w:before="179" w:line="259" w:lineRule="auto"/>
-              <w:ind w:right="374"/>
-              <w:jc w:val="center"/>
-              <w:rPr>
-                <w:rFonts w:asciiTheme="minorHAnsi" w:hAnsiTheme="minorHAnsi" w:cstheme="minorHAnsi"/>
-                <w:b/>
-                <w:bCs/>
-                <w:caps/>
-                <w:sz w:val="32"/>
-                <w:szCs w:val="32"/>
-              </w:rPr>
-            </w:pPr>
-          </w:p>
-          <w:p>
-            <w:pPr>
-              <w:pStyle w:val="BodyText"/>
-              <w:tabs>
-                <w:tab w:val="left" w:pos="6086"/>
-              </w:tabs>
-              <w:spacing w:before="179" w:line="259" w:lineRule="auto"/>
-              <w:ind w:right="374"/>
-              <w:jc w:val="center"/>
-              <w:rPr>
-                <w:rFonts w:asciiTheme="minorHAnsi" w:hAnsiTheme="minorHAnsi" w:cstheme="minorHAnsi"/>
-                <w:b/>
-                <w:bCs/>
-                <w:caps/>
-                <w:sz w:val="32"/>
-                <w:szCs w:val="32"/>
-              </w:rPr>
-            </w:pPr>
-          </w:p>
-          <w:p>
-            <w:pPr>
-              <w:pStyle w:val="BodyText"/>
-              <w:tabs>
-                <w:tab w:val="left" w:pos="6086"/>
-              </w:tabs>
-              <w:spacing w:before="179" w:line="259" w:lineRule="auto"/>
-              <w:ind w:right="374"/>
-              <w:jc w:val="center"/>
-              <w:rPr>
-                <w:rFonts w:asciiTheme="minorHAnsi" w:hAnsiTheme="minorHAnsi" w:cstheme="minorHAnsi"/>
-                <w:b/>
-                <w:bCs/>
-                <w:caps/>
-                <w:sz w:val="32"/>
-                <w:szCs w:val="32"/>
-              </w:rPr>
-            </w:pPr>
-          </w:p>
-          <w:p>
-            <w:pPr>
-              <w:pStyle w:val="BodyText"/>
-              <w:tabs>
-                <w:tab w:val="left" w:pos="6086"/>
-              </w:tabs>
-              <w:spacing w:before="179" w:line="259" w:lineRule="auto"/>
-              <w:ind w:right="374"/>
-              <w:jc w:val="center"/>
-              <w:rPr>
-                <w:rFonts w:asciiTheme="minorHAnsi" w:hAnsiTheme="minorHAnsi" w:cstheme="minorHAnsi"/>
-                <w:b/>
-                <w:bCs/>
-                <w:caps/>
-                <w:sz w:val="32"/>
-                <w:szCs w:val="32"/>
-              </w:rPr>
-            </w:pPr>
-          </w:p>
-          <w:p>
-            <w:pPr>
-              <w:pStyle w:val="BodyText"/>
-              <w:tabs>
-                <w:tab w:val="left" w:pos="6086"/>
-              </w:tabs>
-              <w:spacing w:before="179" w:line="259" w:lineRule="auto"/>
-              <w:ind w:right="374"/>
-              <w:jc w:val="center"/>
-              <w:rPr>
-                <w:rFonts w:asciiTheme="minorHAnsi" w:hAnsiTheme="minorHAnsi" w:cstheme="minorHAnsi"/>
-                <w:b/>
-                <w:bCs/>
-                <w:caps/>
-                <w:sz w:val="32"/>
-                <w:szCs w:val="32"/>
-              </w:rPr>
-            </w:pPr>
-          </w:p>
-          <w:p>
-            <w:pPr>
-              <w:pStyle w:val="BodyText"/>
-              <w:tabs>
-                <w:tab w:val="left" w:pos="6086"/>
-              </w:tabs>
-              <w:spacing w:before="179" w:line="259" w:lineRule="auto"/>
-              <w:ind w:right="374"/>
-              <w:jc w:val="center"/>
-              <w:rPr>
-                <w:rFonts w:asciiTheme="minorHAnsi" w:hAnsiTheme="minorHAnsi" w:cstheme="minorHAnsi"/>
-                <w:b/>
-                <w:bCs/>
-                <w:caps/>
-                <w:sz w:val="32"/>
-                <w:szCs w:val="32"/>
-              </w:rPr>
-            </w:pPr>
-          </w:p>
-          <w:p>
-            <w:pPr>
-              <w:pStyle w:val="BodyText"/>
-              <w:tabs>
-                <w:tab w:val="left" w:pos="6086"/>
-              </w:tabs>
-              <w:spacing w:before="179" w:line="259" w:lineRule="auto"/>
-              <w:ind w:right="374"/>
-              <w:jc w:val="center"/>
-              <w:rPr>
-                <w:rFonts w:asciiTheme="minorHAnsi" w:hAnsiTheme="minorHAnsi" w:cstheme="minorHAnsi"/>
-                <w:b/>
-                <w:bCs/>
-                <w:caps/>
-                <w:sz w:val="32"/>
-                <w:szCs w:val="32"/>
-              </w:rPr>
-            </w:pPr>
-          </w:p>
-          <w:p>
-            <w:pPr>
-              <w:pStyle w:val="BodyText"/>
-              <w:tabs>
-                <w:tab w:val="left" w:pos="6086"/>
-              </w:tabs>
-              <w:spacing w:before="179" w:line="259" w:lineRule="auto"/>
-              <w:ind w:right="374"/>
-              <w:jc w:val="center"/>
-              <w:rPr>
-                <w:rFonts w:asciiTheme="minorHAnsi" w:hAnsiTheme="minorHAnsi" w:cstheme="minorHAnsi"/>
-                <w:b/>
-                <w:bCs/>
-                <w:caps/>
-                <w:sz w:val="32"/>
-                <w:szCs w:val="32"/>
-              </w:rPr>
-            </w:pPr>
-          </w:p>
-          <w:p>
-            <w:pPr>
-              <w:pStyle w:val="BodyText"/>
-              <w:tabs>
-                <w:tab w:val="left" w:pos="6086"/>
-              </w:tabs>
-              <w:spacing w:before="179" w:line="259" w:lineRule="auto"/>
-              <w:ind w:right="374"/>
-              <w:rPr>
-                <w:rFonts w:asciiTheme="minorHAnsi" w:hAnsiTheme="minorHAnsi" w:cstheme="minorHAnsi"/>
-                <w:b/>
-                <w:bCs/>
-                <w:caps/>
-                <w:sz w:val="32"/>
-                <w:szCs w:val="32"/>
-              </w:rPr>
-            </w:pPr>
-          </w:p>
-          <w:p>
-            <w:pPr>
-              <w:pStyle w:val="BodyText"/>
-              <w:tabs>
-                <w:tab w:val="left" w:pos="6086"/>
-              </w:tabs>
-              <w:spacing w:before="179" w:line="259" w:lineRule="auto"/>
-              <w:ind w:right="374"/>
-              <w:jc w:val="center"/>
-              <w:rPr>
-                <w:rFonts w:asciiTheme="minorHAnsi" w:hAnsiTheme="minorHAnsi" w:cstheme="minorHAnsi"/>
-                <w:b/>
-                <w:bCs/>
-                <w:caps/>
-                <w:sz w:val="32"/>
-                <w:szCs w:val="32"/>
-              </w:rPr>
-            </w:pPr>
-            <w:r>
-              <w:rPr>
-                <w:rFonts w:asciiTheme="minorHAnsi" w:hAnsiTheme="minorHAnsi" w:cstheme="minorHAnsi"/>
-                <w:b/>
-                <w:bCs/>
-                <w:caps/>
-                <w:sz w:val="32"/>
-                <w:szCs w:val="32"/>
-              </w:rPr>
-              <w:t>Repair Method</w:t>
-            </w:r>
-          </w:p>
         </w:tc>
       </w:tr>
       <w:tr>

</xml_diff>